<commit_message>
Update disruption recovery prompt with GPU budget, Vercel plan and MBTA line choice
Co-Authored-By: Claude Opus 5.5 <noreply@anthropic.com>
Claude-Session: https://claude.ai/code/session_01AcMcWQU1uSZpUM1CDFCgtf
</commit_message>
<xml_diff>
--- a/prompts/airline-disruption-recovery-prompt.docx
+++ b/prompts/airline-disruption-recovery-prompt.docx
@@ -159,6 +159,14 @@
         <w:spacing w:after="160" w:line="300"/>
       </w:pPr>
       <w:r>
+        <w:t xml:space="preserve">Start with the Red Line, the busiest line, which serves the Kendall/MIT station, has two southern branches (Ashmont and Braintree) that make short-turn and branch-balancing decisions meaningful, and has a long record of slow zones and disruptions. Add the Orange Line second as a test of transfer to another line. Leave the Green Line (light rail with street running and several branches) and buses for later. Walk me through getting an MBTA V3 API key when it is first needed, since I have not used the MBTA developer portal before.</w:t>
+      </w:r>
+    </w:p>
+    <w:p>
+      <w:pPr>
+        <w:spacing w:after="160" w:line="300"/>
+      </w:pPr>
+      <w:r>
         <w:t xml:space="preserve">Define a disruption episode as a period when observed headways on a line deviate badly from schedule. Define recovery actions that can be observed or inferred from the data, such as short-turns, holds, expressing, added trips and shuttle bus bridges. Label an episode as a success by an explicit, documented outcome measure, for example how quickly passenger-weighted headway regularity returned to schedule. Say plainly which actions are directly observed and which are inferred, because the MBTA does not publish dispatcher decisions as such.</w:t>
       </w:r>
     </w:p>
@@ -427,7 +435,7 @@
         <w:spacing w:after="160" w:line="300"/>
       </w:pPr>
       <w:r>
-        <w:t xml:space="preserve">Respect Vercel's limits. Use serverless functions only for light work, respect function duration limits and the 4.5 MB response body limit, serve prebuilt geometry and replay data as static files, and poll the realtime feeds rather than holding streaming connections in functions. Call the Lightning service for inference and solving, and keep Lightning cold starts out of the live demo path (for example by precomputing the replayed airline days and warming the service). The Vercel Hobby plan is for non-commercial use only, so ask me whether the airline pitch needs a Pro plan.</w:t>
+        <w:t xml:space="preserve">Respect Vercel's limits. Use serverless functions only for light work, respect function duration limits and the 4.5 MB response body limit, serve prebuilt geometry and replay data as static files, and poll the realtime feeds rather than holding streaming connections in functions. Call the Lightning service for inference and solving, and keep Lightning cold starts out of the live demo path (for example by precomputing the replayed airline days and warming the service). I have a paid Vercel plan, so commercial use is allowed; still keep within its function and bandwidth limits.</w:t>
       </w:r>
     </w:p>
     <w:p>
@@ -443,7 +451,7 @@
         <w:spacing w:after="160" w:line="300"/>
       </w:pPr>
       <w:r>
-        <w:t xml:space="preserve">Training and heavy solving run on my Lightning AI account. Use a Lightning Studio with a GPU for training. Serve the proposer and the OR-Tools solver as an HTTPS inference API from Lightning (for example with LitServe) that the Vercel site calls. Keep everything runnable on CPU for tests. Estimate GPU hours and cost before any long training run, and ask me before exceeding eight GPU hours.</w:t>
+        <w:t xml:space="preserve">Training and heavy solving run on my Lightning AI account. The GPU budget is a hard limit of one H100 for eight hours in total across the whole project, covering every training run, sweep and Gauntlet experiment. Do all development, debugging, tests and small experiments on CPU first, and use the H100 only for runs that have already worked end to end on CPU at small scale. Keep a GPU ledger in GPU_LEDGER.md recording the start time, end time and purpose of every GPU session, and stop the Studio's GPU as soon as each run ends so idle time is not billed. Plan the eight hours before starting, tell me the plan, and stop and ask me before any run that would push the total past eight hours. Serve the proposer and the OR-Tools solver as an HTTPS inference API from Lightning (for example with LitServe) running on CPU, not on the H100, so that serving never consumes the GPU budget; if CPU inference is too slow, precompute results instead of serving from the GPU.</w:t>
       </w:r>
     </w:p>
     <w:p>
@@ -855,14 +863,6 @@
         <w:spacing w:after="160" w:line="300"/>
       </w:pPr>
       <w:r>
-        <w:t xml:space="preserve">- which MBTA lines to start with;</w:t>
-      </w:r>
-    </w:p>
-    <w:p>
-      <w:pPr>
-        <w:spacing w:after="160" w:line="300"/>
-      </w:pPr>
-      <w:r>
         <w:t xml:space="preserve">- which airline and which historical events to replay first;</w:t>
       </w:r>
     </w:p>
@@ -872,14 +872,6 @@
       </w:pPr>
       <w:r>
         <w:t xml:space="preserve">- the Anthropic spending cap and the GPU budget;</w:t>
-      </w:r>
-    </w:p>
-    <w:p>
-      <w:pPr>
-        <w:spacing w:after="160" w:line="300"/>
-      </w:pPr>
-      <w:r>
-        <w:t xml:space="preserve">- the Vercel plan;</w:t>
       </w:r>
     </w:p>
     <w:p>

</xml_diff>